<commit_message>
Fix audit findings: factual precision in markdown and quiz
- Chess states: 10^43 (Shannon 1950), not 10^47
- IDS overhead: clarify total work is b^d * b/(b-1), not just prior layers
- Minimax theorem: credit von Neumann (1928), formalized in 1944
- Quiz Q2: replace duplicate distractor 9! with 3,628,800
- Regenerated both DOCX files with corrections

Co-Authored-By: Claude Opus 4.6 <noreply@anthropic.com>
</commit_message>
<xml_diff>
--- a/docs/Documento_Academico_BloqueB_Ruffo_Espinosa.docx
+++ b/docs/Documento_Academico_BloqueB_Ruffo_Espinosa.docx
@@ -864,7 +864,7 @@
           <w:rFonts w:ascii="Calibri" w:hAnsi="Calibri"/>
           <w:sz w:val="24"/>
         </w:rPr>
-        <w:t>La complejidad del espacio de estados es un factor determinante en la seleccion del algoritmo. Para el ajedrez, el espacio tiene aproximadamente 10^47 estados legales (Shannon, 1950). Para el juego de Go, la cifra asciende a 10^170, lo que hace inviable cualquier enumeracion exhaustiva y motiva el uso de heuristicas y metodos de Monte Carlo (Silver et al., 2016).</w:t>
+        <w:t>La complejidad del espacio de estados es un factor determinante en la seleccion del algoritmo. Para el ajedrez, el espacio tiene aproximadamente 10^43 estados legales (Shannon, 1950). Para el juego de Go, la cifra asciende a 10^170, lo que hace inviable cualquier enumeracion exhaustiva y motiva el uso de heuristicas y metodos de Monte Carlo (Silver et al., 2016).</w:t>
       </w:r>
     </w:p>
     <w:p>
@@ -1248,7 +1248,7 @@
           <w:rFonts w:ascii="Calibri" w:hAnsi="Calibri"/>
           <w:sz w:val="24"/>
         </w:rPr>
-        <w:t>Aunque pareciera ineficiente regenerar los niveles superiores, el trabajo redundante es insignificante: la capa d tiene b^d nodos, mientras que todas las capas anteriores suman b^d (b/(b-1)), un factor constante. IDS es el algoritmo de busqueda no informada preferido cuando el espacio de estados es grande y la profundidad de la solucion es desconocida (Russell y Norvig, 2021).</w:t>
+        <w:t>Aunque pareciera ineficiente regenerar los niveles superiores, el trabajo redundante es insignificante: la capa d tiene b^d nodos, y el trabajo total de IDS es aproximadamente b^d * b/(b-1), un factor constante respecto a BFS. IDS es el algoritmo de busqueda no informada preferido cuando el espacio de estados es grande y la profundidad de la solucion es desconocida (Russell y Norvig, 2021).</w:t>
       </w:r>
     </w:p>
     <w:p>
@@ -2103,7 +2103,7 @@
           <w:rFonts w:ascii="Calibri" w:hAnsi="Calibri"/>
           <w:sz w:val="24"/>
         </w:rPr>
-        <w:t>Von Neumann y Morgenstern (1944) demostraron el teorema minimax: en un juego finito de suma cero con informacion perfecta, existe una estrategia optima para cada jugador y un valor del juego determinado. Este resultado fundamental establece que la teoria de juegos tiene una solucion racional bien definida.</w:t>
+        <w:t>Von Neumann demostro el teorema minimax en 1928, formalizado extensamente en Von Neumann y Morgenstern (1944): en un juego finito de suma cero con informacion perfecta, existe una estrategia optima para cada jugador y un valor del juego determinado. Este resultado fundamental establece que la teoria de juegos tiene una solucion racional bien definida.</w:t>
       </w:r>
     </w:p>
     <w:p>

</xml_diff>